<commit_message>
[Truong] Hoàn thiện DMS tích hợp Firebase và báo cáo Cloud
Co-authored-by: Copilot <223556219+Copilot@users.noreply.github.com>
</commit_message>
<xml_diff>
--- a/study_document_manager/BAO_CAO_TICH_HOP_CLOUD.docx
+++ b/study_document_manager/BAO_CAO_TICH_HOP_CLOUD.docx
@@ -46,7 +46,13 @@
     </w:p>
     <w:p>
       <w:r>
-        <w:t>Ứng dụng Flutter hiện quản lý metadata tài liệu/môn học bằng SQLite cục bộ. Bản tích hợp thực tế đã bổ sung Google Authentication và Firebase Cloud Storage cho file trên Android, iOS và Web. Storage Rules giới hạn đường dẫn theo UID, loại MIME khai báo và dung lượng tối đa 20 MiB. Tuy nhiên, metadata vẫn ở SQLite của từng thiết bị: ứng dụng chưa đồng bộ danh sách tài liệu giữa các thiết bị, chưa có Firestore và chưa có Backend/API riêng.</w:t>
+        <w:t xml:space="preserve">Ứng dụng Flutter hiện quản lý metadata tài liệu/môn học bằng SQLite cục bộ. </w:t>
+      </w:r>
+      <w:r>
+        <w:t>Mã nguồn đã tích hợp Google Authentication và Firebase Cloud Storage cho Android và Web; iOS chưa được cấu hình.</w:t>
+      </w:r>
+      <w:r>
+        <w:t xml:space="preserve"> Storage Rules giới hạn đường dẫn theo UID, loại MIME khai báo và dung lượng tối đa 20 MiB. Tuy nhiên, metadata vẫn ở SQLite của từng thiết bị: ứng dụng chưa đồng bộ danh sách tài liệu giữa các thiết bị, chưa có Firestore và chưa có Backend/API riêng.</w:t>
       </w:r>
     </w:p>
     <w:p>
@@ -160,7 +166,7 @@
           </w:tcPr>
           <w:p>
             <w:r>
-              <w:t>Dùng chung cho Android, iOS và Web; hiển thị trạng thái đăng nhập và tiến độ upload.</w:t>
+              <w:t>Firebase được cấu hình cho Android và Web; hiển thị trạng thái đăng nhập và tiến độ upload.</w:t>
             </w:r>
           </w:p>
         </w:tc>
@@ -214,7 +220,7 @@
           </w:tcPr>
           <w:p>
             <w:r>
-              <w:t>SQLite lưu subjects, documents cùng thuộc tính tài liệu. storage_path được thêm qua migration schema version 2.</w:t>
+              <w:t>SQLite lưu subjects, documents cùng thuộc tính tài liệu. Schema version 4 có storage_path, sync metadata và owner scoping.</w:t>
             </w:r>
           </w:p>
         </w:tc>
@@ -268,28 +274,36 @@
           </w:tcPr>
           <w:p>
             <w:r>
+              <w:t>Danh tính</w:t>
+            </w:r>
+          </w:p>
+        </w:tc>
+        <w:tc>
+          <w:tcPr>
+            <w:tcW w:w="2930" w:type="dxa"/>
+          </w:tcPr>
+          <w:p>
+            <w:r>
+              <w:t xml:space="preserve">Firebase Authentication với Google Sign-In trên Android </w:t>
+            </w:r>
+            <w:r>
               <w:lastRenderedPageBreak/>
-              <w:t>Danh tính</w:t>
-            </w:r>
-          </w:p>
-        </w:tc>
-        <w:tc>
-          <w:tcPr>
-            <w:tcW w:w="2930" w:type="dxa"/>
-          </w:tcPr>
-          <w:p>
-            <w:r>
-              <w:t>Firebase Authentication với Google Sign-In trên Android, iOS và Web.</w:t>
-            </w:r>
-          </w:p>
-        </w:tc>
-        <w:tc>
-          <w:tcPr>
-            <w:tcW w:w="2930" w:type="dxa"/>
-          </w:tcPr>
-          <w:p>
-            <w:r>
-              <w:t>SHA-1 Android, cấu hình iOS và Authorized Domain Web phải khớp Firebase Console.</w:t>
+              <w:t>và Web; iOS chưa được cấu hình.</w:t>
+            </w:r>
+          </w:p>
+        </w:tc>
+        <w:tc>
+          <w:tcPr>
+            <w:tcW w:w="2930" w:type="dxa"/>
+          </w:tcPr>
+          <w:p>
+            <w:r>
+              <w:lastRenderedPageBreak/>
+              <w:t xml:space="preserve">SHA-1 Android và Authorized Domain Web phải khớp </w:t>
+            </w:r>
+            <w:r>
+              <w:lastRenderedPageBreak/>
+              <w:t>Firebase Console; iOS chưa được cấu hình.</w:t>
             </w:r>
           </w:p>
         </w:tc>
@@ -298,7 +312,13 @@
     <w:p/>
     <w:p>
       <w:r>
-        <w:t>Các điểm triển khai chính: lib/main.dart khởi tạo Firebase trên Android/iOS/Web; lib/struct/google_auth_service.dart xử lý đăng nhập; lib/struct/firebase_storage_service.dart xử lý upload/download URL/xóa; lib/database/app_database.dart quản lý SQLite và migration; storage.rules giới hạn truy cập Storage.</w:t>
+        <w:t xml:space="preserve">Các điểm triển khai chính: </w:t>
+      </w:r>
+      <w:r>
+        <w:t>lib/main.dart khởi tạo Firebase trên Android/Web;</w:t>
+      </w:r>
+      <w:r>
+        <w:t xml:space="preserve"> lib/struct/google_auth_service.dart xử lý đăng nhập; lib/struct/firebase_storage_service.dart xử lý upload/download URL/xóa; lib/database/app_database.dart quản lý SQLite và migration; storage.rules giới hạn truy cập Storage.</w:t>
       </w:r>
     </w:p>
     <w:p>
@@ -1403,7 +1423,13 @@
     </w:p>
     <w:p>
       <w:r>
-        <w:t xml:space="preserve">    3. Thêm SHA-1 cho Android; kiểm tra iOS URL scheme/client ID; cho phép domain đang dùng cho Web.</w:t>
+        <w:t xml:space="preserve">    3. Thêm SHA-1 cho Android; </w:t>
+      </w:r>
+      <w:r>
+        <w:t>iOS chưa được cấu hình;</w:t>
+      </w:r>
+      <w:r>
+        <w:t xml:space="preserve"> cho phép domain đang dùng cho Web.</w:t>
       </w:r>
     </w:p>
     <w:p>
@@ -1746,7 +1772,10 @@
     </w:p>
     <w:p>
       <w:r>
-        <w:t>Prototype đã chứng minh đăng nhập Google và lưu tệp trên Firebase Storage trong kiến trúc Flutter + SQLite local. Không nên tuyên bố metadata đa thiết bị, Firestore, Backend riêng, đồng bộ offline hay kiểm thử Firebase production đã hoàn tất. Phần báo cáo và slide tách rõ những gì đã có khỏi phần mở rộng đề xuất; nhóm cần hoàn tất cấu hình Console và chạy kịch bản demo trước khi khẳng định luồng Firebase thật hoạt động.</w:t>
+        <w:t>Mã nguồn có luồng Google Sign-In và Firebase Storage; cấu hình thật chưa được xác nhận trên Console</w:t>
+      </w:r>
+      <w:r>
+        <w:t xml:space="preserve"> trong kiến trúc Flutter + SQLite local. Không nên tuyên bố metadata đa thiết bị, Firestore, Backend riêng, đồng bộ offline hay kiểm thử Firebase production đã hoàn tất. Phần báo cáo và slide tách rõ những gì đã có khỏi phần mở rộng đề xuất; nhóm cần hoàn tất cấu hình Console và chạy kịch bản demo trước khi khẳng định luồng Firebase thật hoạt động.</w:t>
       </w:r>
     </w:p>
     <w:p/>

</xml_diff>